<commit_message>
Registra encerramento e visibilidade pública do projeto
</commit_message>
<xml_diff>
--- a/docs/relatorio_tecnico_final.docx
+++ b/docs/relatorio_tecnico_final.docx
@@ -1582,7 +1582,46 @@
         <w:t>17:16:22</w:t>
       </w:r>
       <w:r>
-        <w:t xml:space="preserve"> (America/Sao_Paulo). Ele é um marco aproximado da retomada, não a hora exata de envio da primeira mensagem. O horário final deve ser preenchido quando a sessão terminar; pausas de hoje não foram informadas. Ver </w:t>
+        <w:t xml:space="preserve"> (America/Sao_Paulo). Ele é um marco aproximado da retomada, não a hora exata de envio da primeira mensagem. Às </w:t>
+      </w:r>
+      <w:r>
+        <w:rPr>
+          <w:b/>
+        </w:rPr>
+        <w:t>19:13</w:t>
+      </w:r>
+      <w:r>
+        <w:t xml:space="preserve"> o responsável confirmou a visibilidade privada; às </w:t>
+      </w:r>
+      <w:r>
+        <w:rPr>
+          <w:b/>
+        </w:rPr>
+        <w:t>19:17</w:t>
+      </w:r>
+      <w:r>
+        <w:t xml:space="preserve"> confirmou a alteração para público, verificada separadamente pela API do GitHub. O intervalo entre o primeiro marco visual e a confirmação pública foi de aproximadamente </w:t>
+      </w:r>
+      <w:r>
+        <w:rPr>
+          <w:b/>
+        </w:rPr>
+        <w:t>2h00min38s</w:t>
+      </w:r>
+      <w:r>
+        <w:t xml:space="preserve">. Pausas de hoje não foram informadas; horas efetivas não foram apuradas. O recibo </w:t>
+      </w:r>
+      <w:r>
+        <w:t>FINAL01</w:t>
+      </w:r>
+      <w:r>
+        <w:t xml:space="preserve"> não testa a visibilidade e conserva </w:t>
+      </w:r>
+      <w:r>
+        <w:t>not_verified</w:t>
+      </w:r>
+      <w:r>
+        <w:t xml:space="preserve"> nesse item. Ver </w:t>
       </w:r>
       <w:r>
         <w:t>docs/registro_diario.md</w:t>

</xml_diff>